<commit_message>
Create run & sprint
- Create run
- Create sprint
- Create stamina
</commit_message>
<xml_diff>
--- a/Docs/Diary.docx
+++ b/Docs/Diary.docx
@@ -41,7 +41,35 @@
         <w:rPr>
           <w:szCs w:val="28"/>
         </w:rPr>
-        <w:t>Главный герой живёт в неблагополучном городке где-то в глубинке (России?) и работает в подобии торгового центра. Старое здание с несколькими этажами и тесными комнатушками, отдёлёнными друг от друга фанерными стенами, где расположились продавцы. Больше напоминает рынок нежели торговый центр. И наш главный герой работает складовщиком в одном из таких магазинчиков. В один замечательный день он (может дать ему имя?) задерживается на работе до полуночи (уснул или переработал), и обнаруживает что время уже позднее (</w:t>
+        <w:t xml:space="preserve">Главный герой живёт в неблагополучном городке где-то в глубинке (России?) и работает в подобии торгового центра. Старое здание с несколькими этажами и тесными комнатушками, отдёлёнными друг от друга фанерными стенами, где расположились продавцы. Больше напоминает </w:t>
+      </w:r>
+      <w:proofErr w:type="gramStart"/>
+      <w:r>
+        <w:rPr>
+          <w:szCs w:val="28"/>
+        </w:rPr>
+        <w:t>рынок</w:t>
+      </w:r>
+      <w:proofErr w:type="gramEnd"/>
+      <w:r>
+        <w:rPr>
+          <w:szCs w:val="28"/>
+        </w:rPr>
+        <w:t xml:space="preserve"> нежели торговый центр. И наш главный герой работает </w:t>
+      </w:r>
+      <w:proofErr w:type="spellStart"/>
+      <w:r>
+        <w:rPr>
+          <w:szCs w:val="28"/>
+        </w:rPr>
+        <w:t>складовщиком</w:t>
+      </w:r>
+      <w:proofErr w:type="spellEnd"/>
+      <w:r>
+        <w:rPr>
+          <w:szCs w:val="28"/>
+        </w:rPr>
+        <w:t xml:space="preserve"> в одном из таких магазинчиков. В один замечательный день он (может дать ему имя?) задерживается на работе до полуночи (уснул или переработал), и обнаруживает что время уже позднее (</w:t>
       </w:r>
       <w:r>
         <w:rPr>
@@ -65,7 +93,63 @@
         <w:rPr>
           <w:szCs w:val="28"/>
         </w:rPr>
-        <w:t xml:space="preserve">и двигает к выходу. По дороге к выходу он слышит разные странные и подозрительные звуки, ускоряясь к выходу тот ожидаемо оказывается закрыт. Внезапно герой слышит за спиной прямо по коридору грохот, обернувшись он видит выглядывающую тёмную голому с белыми глазами и мрачной улыбкой (возможно стоит обойтись с минимумо кат сцен чтобы не создавать у игрока чувства безопасности). Это нечто начинает выходить из-за угла и двигать к игроку, тот в свою очередь должен додуматься бежать в поворот чуть впереди (в моменте игрок и монстр двигаются друг другу навстречу) и начинает бегать по тесным коридорам спасаясь от монстра (добавить динамики). Пока дальше расписывать </w:t>
+        <w:t xml:space="preserve">и двигает к выходу. По дороге к выходу он слышит разные странные и подозрительные звуки, </w:t>
+      </w:r>
+      <w:proofErr w:type="gramStart"/>
+      <w:r>
+        <w:rPr>
+          <w:szCs w:val="28"/>
+        </w:rPr>
+        <w:t>ускоряясь к выходу тот ожидаемо оказывается</w:t>
+      </w:r>
+      <w:proofErr w:type="gramEnd"/>
+      <w:r>
+        <w:rPr>
+          <w:szCs w:val="28"/>
+        </w:rPr>
+        <w:t xml:space="preserve"> закрыт. Внезапно герой слышит за спиной прямо по коридору грохот, обернувшись он видит выглядывающую тёмную голому с белыми глазами и мрачной улыбкой (</w:t>
+      </w:r>
+      <w:proofErr w:type="gramStart"/>
+      <w:r>
+        <w:rPr>
+          <w:szCs w:val="28"/>
+        </w:rPr>
+        <w:t>возможно</w:t>
+      </w:r>
+      <w:proofErr w:type="gramEnd"/>
+      <w:r>
+        <w:rPr>
+          <w:szCs w:val="28"/>
+        </w:rPr>
+        <w:t xml:space="preserve"> стоит обойтись с </w:t>
+      </w:r>
+      <w:proofErr w:type="spellStart"/>
+      <w:r>
+        <w:rPr>
+          <w:szCs w:val="28"/>
+        </w:rPr>
+        <w:t>минимумо</w:t>
+      </w:r>
+      <w:proofErr w:type="spellEnd"/>
+      <w:r>
+        <w:rPr>
+          <w:szCs w:val="28"/>
+        </w:rPr>
+        <w:t xml:space="preserve"> кат сцен чтобы не создавать у игрока чувства безопасности). Это нечто начинает выходить из-за угла и двигать к игроку, тот в свою очередь должен додуматься бежать в поворот чуть впереди (в моменте игрок и монстр двигаются друг другу навстречу) и </w:t>
+      </w:r>
+      <w:proofErr w:type="gramStart"/>
+      <w:r>
+        <w:rPr>
+          <w:szCs w:val="28"/>
+        </w:rPr>
+        <w:t>начинает бегать по тесным коридорам спасаясь</w:t>
+      </w:r>
+      <w:proofErr w:type="gramEnd"/>
+      <w:r>
+        <w:rPr>
+          <w:szCs w:val="28"/>
+        </w:rPr>
+        <w:t xml:space="preserve"> от монстра (добавить динамики). Пока дальше расписывать </w:t>
       </w:r>
       <w:r>
         <w:rPr>
@@ -89,13 +173,55 @@
         <w:rPr>
           <w:szCs w:val="28"/>
         </w:rPr>
-        <w:t>я цель игры будет банальной - искать какие нибудь ключи спасаясь от монстров (будет ли время до утра идти по сюжету или просто во время игры?)</w:t>
-      </w:r>
-      <w:r>
-        <w:rPr>
-          <w:szCs w:val="28"/>
-        </w:rPr>
-        <w:t>. Возможно стоит дать игроку фонарик и батарейки (а желательно несколько, при условии что он их будет терять например во время захватов монстрами)</w:t>
+        <w:t xml:space="preserve">я цель игры будет банальной - искать какие </w:t>
+      </w:r>
+      <w:proofErr w:type="spellStart"/>
+      <w:r>
+        <w:rPr>
+          <w:szCs w:val="28"/>
+        </w:rPr>
+        <w:t>нибудь</w:t>
+      </w:r>
+      <w:proofErr w:type="spellEnd"/>
+      <w:r>
+        <w:rPr>
+          <w:szCs w:val="28"/>
+        </w:rPr>
+        <w:t xml:space="preserve"> </w:t>
+      </w:r>
+      <w:proofErr w:type="gramStart"/>
+      <w:r>
+        <w:rPr>
+          <w:szCs w:val="28"/>
+        </w:rPr>
+        <w:t>ключи</w:t>
+      </w:r>
+      <w:proofErr w:type="gramEnd"/>
+      <w:r>
+        <w:rPr>
+          <w:szCs w:val="28"/>
+        </w:rPr>
+        <w:t xml:space="preserve"> спасаясь от монстров (будет ли время до утра идти по сюжету или просто во время игры?)</w:t>
+      </w:r>
+      <w:r>
+        <w:rPr>
+          <w:szCs w:val="28"/>
+        </w:rPr>
+        <w:t xml:space="preserve">. </w:t>
+      </w:r>
+      <w:proofErr w:type="gramStart"/>
+      <w:r>
+        <w:rPr>
+          <w:szCs w:val="28"/>
+        </w:rPr>
+        <w:t>Возможно</w:t>
+      </w:r>
+      <w:proofErr w:type="gramEnd"/>
+      <w:r>
+        <w:rPr>
+          <w:szCs w:val="28"/>
+        </w:rPr>
+        <w:t xml:space="preserve"> стоит дать игроку фонарик и батарейки (а желательно несколько, при условии что он их будет терять например во время захватов монстрами)</w:t>
       </w:r>
     </w:p>
     <w:p>
@@ -103,8 +229,13 @@
         <w:pStyle w:val="2"/>
       </w:pPr>
       <w:r>
-        <w:t>Теория практической</w:t>
-      </w:r>
+        <w:t xml:space="preserve">Теория </w:t>
+      </w:r>
+      <w:proofErr w:type="gramStart"/>
+      <w:r>
+        <w:t>практической</w:t>
+      </w:r>
+      <w:proofErr w:type="gramEnd"/>
       <w:r>
         <w:t xml:space="preserve"> реализация</w:t>
       </w:r>
@@ -116,21 +247,111 @@
         </w:rPr>
       </w:pPr>
       <w:r>
-        <w:t xml:space="preserve">На словах игрушки придумывать круто, но это получаются тогда уж книги без гемплея-то. В качестве двжика возьму юнити, закроет и потребность в его изучении и низкий уровень опыта, хотя с точки зрения игр </w:t>
+        <w:t xml:space="preserve">На словах игрушки придумывать круто, но это получаются тогда уж книги без </w:t>
+      </w:r>
+      <w:proofErr w:type="spellStart"/>
+      <w:r>
+        <w:t>гемплея-то</w:t>
+      </w:r>
+      <w:proofErr w:type="spellEnd"/>
+      <w:r>
+        <w:t xml:space="preserve">. В качестве </w:t>
+      </w:r>
+      <w:proofErr w:type="spellStart"/>
+      <w:r>
+        <w:t>двжика</w:t>
+      </w:r>
+      <w:proofErr w:type="spellEnd"/>
+      <w:r>
+        <w:t xml:space="preserve"> возьму </w:t>
+      </w:r>
+      <w:proofErr w:type="spellStart"/>
+      <w:r>
+        <w:t>юнити</w:t>
+      </w:r>
+      <w:proofErr w:type="spellEnd"/>
+      <w:r>
+        <w:t xml:space="preserve">, закроет и потребность в его изучении и низкий уровень опыта, хотя с точки зрения игр </w:t>
       </w:r>
       <w:r>
         <w:lastRenderedPageBreak/>
-        <w:t xml:space="preserve">для продажи движок думаю не тот. Акцент буду делать что логично на атмосфере (звуки графика свет) ну и стараться углубляться в программную часть. Атмосферу буду задавать после рабочего прототипа. К слову о прототипе в планах на ближайшее время сделать собственно механику ходьбы и взаимодействия и локацию по которой ходить. Если я сделаю это у же можно медальку дать. Самое интересное сейчас - где вести задачи? В идеале не хочу ограничиваться одним инструментом (примитивный список задач или только графики) и хотелось бы их совместить, но если распыляться на разные инструменты то задачи банально могут начать расходится и будет сложно котнролировать их везде. </w:t>
-      </w:r>
-      <w:r>
-        <w:t xml:space="preserve">Разнообразия ради попробую основной прогресс задач строить с помощью схем в </w:t>
-      </w:r>
+        <w:t xml:space="preserve">для продажи движок думаю не тот. Акцент буду </w:t>
+      </w:r>
+      <w:proofErr w:type="gramStart"/>
+      <w:r>
+        <w:t>делать</w:t>
+      </w:r>
+      <w:proofErr w:type="gramEnd"/>
+      <w:r>
+        <w:t xml:space="preserve"> что логично на атмосфере (звуки графика свет) ну и стараться углубляться в программную часть. Атмосферу буду задавать после рабочего прототипа. К слову о прототипе в планах на ближайшее время сделать собственно механику ходьбы и взаимодействия и </w:t>
+      </w:r>
+      <w:proofErr w:type="gramStart"/>
+      <w:r>
+        <w:t>локацию</w:t>
+      </w:r>
+      <w:proofErr w:type="gramEnd"/>
+      <w:r>
+        <w:t xml:space="preserve"> по которой ходить. Если я сделаю это </w:t>
+      </w:r>
+      <w:proofErr w:type="gramStart"/>
+      <w:r>
+        <w:t>у</w:t>
+      </w:r>
+      <w:proofErr w:type="gramEnd"/>
+      <w:r>
+        <w:t xml:space="preserve"> же можно медальку дать. </w:t>
+      </w:r>
+      <w:proofErr w:type="gramStart"/>
+      <w:r>
+        <w:t>Самое</w:t>
+      </w:r>
+      <w:proofErr w:type="gramEnd"/>
+      <w:r>
+        <w:t xml:space="preserve"> интересное сейчас - где вести задачи? В идеале не хочу ограничиваться одним инструментом (примитивный список задач или только графики) и хотелось бы их совместить, но если распыляться на разные </w:t>
+      </w:r>
+      <w:proofErr w:type="gramStart"/>
+      <w:r>
+        <w:t>инструменты</w:t>
+      </w:r>
+      <w:proofErr w:type="gramEnd"/>
+      <w:r>
+        <w:t xml:space="preserve"> то задачи банально могут начать расходится и будет сложно </w:t>
+      </w:r>
+      <w:proofErr w:type="spellStart"/>
+      <w:r>
+        <w:t>котнролировать</w:t>
+      </w:r>
+      <w:proofErr w:type="spellEnd"/>
+      <w:r>
+        <w:t xml:space="preserve"> их везде. </w:t>
+      </w:r>
+      <w:r>
+        <w:t xml:space="preserve">Разнообразия </w:t>
+      </w:r>
+      <w:proofErr w:type="gramStart"/>
+      <w:r>
+        <w:t>ради</w:t>
+      </w:r>
+      <w:proofErr w:type="gramEnd"/>
+      <w:r>
+        <w:t xml:space="preserve"> попробую </w:t>
+      </w:r>
+      <w:proofErr w:type="gramStart"/>
+      <w:r>
+        <w:t>основной</w:t>
+      </w:r>
+      <w:proofErr w:type="gramEnd"/>
+      <w:r>
+        <w:t xml:space="preserve"> прогресс задач строить с помощью схем в </w:t>
+      </w:r>
+      <w:proofErr w:type="spellStart"/>
       <w:r>
         <w:rPr>
           <w:lang w:val="en-US"/>
         </w:rPr>
         <w:t>drawio</w:t>
       </w:r>
+      <w:proofErr w:type="spellEnd"/>
       <w:r>
         <w:t xml:space="preserve"> </w:t>
       </w:r>
@@ -149,7 +370,47 @@
         <w:t>Разработка</w:t>
       </w:r>
     </w:p>
-    <w:p/>
+    <w:p>
+      <w:r>
+        <w:t xml:space="preserve">В основном последовательность такая: </w:t>
+      </w:r>
+    </w:p>
+    <w:p>
+      <w:pPr>
+        <w:ind w:firstLine="0"/>
+      </w:pPr>
+      <w:r>
+        <w:t>Планирование - Генерация кода - Тестирование - Изучение кода.</w:t>
+      </w:r>
+    </w:p>
+    <w:p>
+      <w:pPr>
+        <w:ind w:firstLine="0"/>
+      </w:pPr>
+      <w:r>
+        <w:t xml:space="preserve">Отсутствие понимания кода может стать большой проблемой в будущем, пусть и не я пишу </w:t>
+      </w:r>
+      <w:proofErr w:type="gramStart"/>
+      <w:r>
+        <w:t>код</w:t>
+      </w:r>
+      <w:proofErr w:type="gramEnd"/>
+      <w:r>
+        <w:t xml:space="preserve"> но я его</w:t>
+      </w:r>
+      <w:r>
+        <w:t xml:space="preserve"> должен контролировать и понимать его устройство</w:t>
+      </w:r>
+      <w:r>
+        <w:t>. По возможности писать код стоит самостоятельно</w:t>
+      </w:r>
+      <w:r>
+        <w:t xml:space="preserve"> (или как минимум редактировать)</w:t>
+      </w:r>
+      <w:r>
+        <w:t xml:space="preserve"> для опыта, иначе какой из меня программист?</w:t>
+      </w:r>
+    </w:p>
     <w:sectPr>
       <w:pgSz w:w="11906" w:h="16838"/>
       <w:pgMar w:top="1134" w:right="850" w:bottom="1134" w:left="1701" w:header="708" w:footer="708" w:gutter="0"/>
@@ -941,7 +1202,7 @@
 </file>
 
 <file path=customXml/itemProps1.xml><?xml version="1.0" encoding="utf-8"?>
-<ds:datastoreItem xmlns:ds="http://schemas.openxmlformats.org/officeDocument/2006/customXml" ds:itemID="{5E262698-2B3F-4B3F-8637-E89CA981806A}">
+<ds:datastoreItem xmlns:ds="http://schemas.openxmlformats.org/officeDocument/2006/customXml" ds:itemID="{D5A88F6C-CE77-427A-BDB0-8703B341E041}">
   <ds:schemaRefs>
     <ds:schemaRef ds:uri="http://schemas.openxmlformats.org/officeDocument/2006/bibliography"/>
   </ds:schemaRefs>

</xml_diff>